<commit_message>
Generalize pitch document for use with any funding source
Reframes the partnerships section from named target labs to illustrative
expertise areas, so the document reads as one universal pitch rather than
audience-specific. No funding sources/investors were ever named in the
document itself.
</commit_message>
<xml_diff>
--- a/docs/pitch/Acheron_Validation_Proposal.docx
+++ b/docs/pitch/Acheron_Validation_Proposal.docx
@@ -2664,15 +2664,15 @@
         <w:spacing w:after="160" w:before="360"/>
       </w:pPr>
       <w:r>
-        <w:t xml:space="preserve">7. Requested Partnerships</w:t>
-      </w:r>
-    </w:p>
-    <w:p>
-      <w:pPr>
-        <w:spacing w:after="160"/>
-      </w:pPr>
-      <w:r>
-        <w:t xml:space="preserve">The specific expertise this project needs is split across a small number of groups whose own published work this proposal builds directly on:</w:t>
+        <w:t xml:space="preserve">7. Expertise This Project Draws On</w:t>
+      </w:r>
+    </w:p>
+    <w:p>
+      <w:pPr>
+        <w:spacing w:after="160"/>
+      </w:pPr>
+      <w:r>
+        <w:t xml:space="preserve">The proposed experiments are designed around published methods from a small number of specialties. For orientation, not as an exclusive list, the kind of expertise involved:</w:t>
       </w:r>
     </w:p>
     <w:p>
@@ -2685,7 +2685,7 @@
         <w:spacing w:after="100"/>
       </w:pPr>
       <w:r>
-        <w:t xml:space="preserve">Long-range bacterial electrical signaling — the Süel lab (UC San Diego), authors of the biofilm potassium-wave signaling work this proposal's Stage 0 design depends on.</w:t>
+        <w:t xml:space="preserve">Long-range bacterial electrical signaling (the biofilm potassium-wave mechanism the Stage 0 design depends on).</w:t>
       </w:r>
     </w:p>
     <w:p>
@@ -2698,7 +2698,7 @@
         <w:spacing w:after="100"/>
       </w:pPr>
       <w:r>
-        <w:t xml:space="preserve">Bacillus subtilis synthetic biology parts — the Mascher/Radeck group (LMU Munich / TU Dresden), originators of the Bacillus BioBrick Box used in the circuit design.</w:t>
+        <w:t xml:space="preserve">Bacillus subtilis synthetic biology parts (the characterized promoter library used in the circuit design).</w:t>
       </w:r>
     </w:p>
     <w:p>
@@ -2711,15 +2711,15 @@
         <w:spacing w:after="100"/>
       </w:pPr>
       <w:r>
-        <w:t xml:space="preserve">Bioelectric regeneration — the Levin Lab (Tufts) and the Wyss Institute (Harvard), for the Stage 2 planarian track. Note: a freedom-to-operate review relative to Levin-lab-adjacent commercial IP (Morphoceuticals) is an open internal item to resolve before this track proceeds to partnership discussions.</w:t>
-      </w:r>
-    </w:p>
-    <w:p>
-      <w:pPr>
-        <w:spacing w:after="160"/>
-      </w:pPr>
-      <w:r>
-        <w:t xml:space="preserve">We are seeking either direct collaboration (data + credibility in exchange for facilities and expertise) or funding earmarked specifically for Stage 0 and Stage 1, run through an academic core facility or contract research partner.</w:t>
+        <w:t xml:space="preserve">Bioelectric regeneration in a whole organism, for the Stage 2 planarian track.</w:t>
+      </w:r>
+    </w:p>
+    <w:p>
+      <w:pPr>
+        <w:spacing w:after="160"/>
+      </w:pPr>
+      <w:r>
+        <w:t xml:space="preserve">We are open to direct collaboration (data and credibility in exchange for facilities and expertise), funding earmarked for specific stages, or a combination of both — structured however best fits the funding source.</w:t>
       </w:r>
     </w:p>
     <w:p>
@@ -2763,7 +2763,7 @@
       <w:r>
         <w:t xml:space="preserve">Manicka, S. &amp; Levin, M. (2019). Modeling somatic computation with non-neural bioelectric networks. Scientific Reports, 9, 18612. </w:t>
       </w:r>
-      <w:hyperlink w:history="1" r:id="rIdp0ujvavhqqba--fwxki3n">
+      <w:hyperlink w:history="1" r:id="rIdqcf1vricamuuztoc7-kng">
         <w:r>
           <w:rPr>
             <w:rStyle w:val="Hyperlink"/>
@@ -2782,7 +2782,7 @@
       <w:r>
         <w:t xml:space="preserve">Mathews, J. &amp; Levin, M. (2016). Gap junctional signaling in pattern regulation: Physiological network connectivity instructs growth and form. Developmental Neurobiology, 77, 643–673. </w:t>
       </w:r>
-      <w:hyperlink w:history="1" r:id="rId6dd1e3mtqmpifopbzwmb5">
+      <w:hyperlink w:history="1" r:id="rIdqehstptlxtrifcn759nyu">
         <w:r>
           <w:rPr>
             <w:rStyle w:val="Hyperlink"/>
@@ -2801,7 +2801,7 @@
       <w:r>
         <w:t xml:space="preserve">Grodstein, J. &amp; Levin, M. (2022). A Computational Approach to Explaining Bioelectrically Induced Persistent, Stochastic Changes of Axial Polarity in Planarian Regeneration. Bioelectricity, 4(1), 18–30. </w:t>
       </w:r>
-      <w:hyperlink w:history="1" r:id="rIdqv9cfirpi6nh2pm26ynd1">
+      <w:hyperlink w:history="1" r:id="rId5uoz1mwqwvwvv2mbd1xjz">
         <w:r>
           <w:rPr>
             <w:rStyle w:val="Hyperlink"/>
@@ -2820,7 +2820,7 @@
       <w:r>
         <w:t xml:space="preserve">Adams, D.S., Tseng, A.S. &amp; Levin, M. (2013). Light-activation of the Archaerhodopsin H+-pump reverses age-dependent loss of vertebrate regeneration. Biology Open, 2(3), 306–313. </w:t>
       </w:r>
-      <w:hyperlink w:history="1" r:id="rIdwslo42g8jzimoryxpluhh">
+      <w:hyperlink w:history="1" r:id="rIdwjzyzqy0wtpnko2hongzs">
         <w:r>
           <w:rPr>
             <w:rStyle w:val="Hyperlink"/>
@@ -2839,7 +2839,7 @@
       <w:r>
         <w:t xml:space="preserve">Samarasinghe, S. (2022). Collective computational intelligence in biology – Emergence of memory in somatic tissues. Biosystems, 223, 104816. </w:t>
       </w:r>
-      <w:hyperlink w:history="1" r:id="rId0uuzdfrq7_ac-dynuvro_">
+      <w:hyperlink w:history="1" r:id="rId9jin3wrr10hkrpm7b5ope">
         <w:r>
           <w:rPr>
             <w:rStyle w:val="Hyperlink"/>
@@ -2858,7 +2858,7 @@
       <w:r>
         <w:t xml:space="preserve">Gardner, T.S., Cantor, C.R. &amp; Collins, J.J. (2000). Construction of a genetic toggle switch in Escherichia coli. Nature, 403, 339–342. </w:t>
       </w:r>
-      <w:hyperlink w:history="1" r:id="rIdik088tpt9f8ml-htisp7s">
+      <w:hyperlink w:history="1" r:id="rIdoc2pgvtk_miozmbw7egu_">
         <w:r>
           <w:rPr>
             <w:rStyle w:val="Hyperlink"/>
@@ -2877,7 +2877,7 @@
       <w:r>
         <w:t xml:space="preserve">Prindle, A. et al. (2015). Ion channels enable electrical communication in bacterial communities. Nature, 527, 59–63. </w:t>
       </w:r>
-      <w:hyperlink w:history="1" r:id="rIdlstumnwmj2_wkkb7qet4l">
+      <w:hyperlink w:history="1" r:id="rIdezdxfg84qbaeyuwuqsgvn">
         <w:r>
           <w:rPr>
             <w:rStyle w:val="Hyperlink"/>
@@ -2896,7 +2896,7 @@
       <w:r>
         <w:t xml:space="preserve">Humphries, J. et al. (2017). Species-Independent Attraction to Biofilms through Electrical Signaling. Cell, 168(1-2), 200–209. </w:t>
       </w:r>
-      <w:hyperlink w:history="1" r:id="rIduqp0xdcsj2cnkpkrqi4uk">
+      <w:hyperlink w:history="1" r:id="rIdhzkltuvry3ub0k2wmo_st">
         <w:r>
           <w:rPr>
             <w:rStyle w:val="Hyperlink"/>
@@ -2915,7 +2915,7 @@
       <w:r>
         <w:t xml:space="preserve">Radeck, J. et al. (2013). The Bacillus BioBrick Box: generation and evaluation of essential genetic building blocks for standardized work with Bacillus subtilis. Journal of Biological Engineering, 7, 29. </w:t>
       </w:r>
-      <w:hyperlink w:history="1" r:id="rIdwfaegr7ax9wravxjrvlad">
+      <w:hyperlink w:history="1" r:id="rIdh-lljsguj8cjhaadqnerk">
         <w:r>
           <w:rPr>
             <w:rStyle w:val="Hyperlink"/>
@@ -2934,7 +2934,7 @@
       <w:r>
         <w:t xml:space="preserve">Radeck, J. et al. (2017). The Bacillus BioBrick Box 2.0: expanding the genetic toolbox for the standardized work with Bacillus subtilis. Scientific Reports, 7, 15058. </w:t>
       </w:r>
-      <w:hyperlink w:history="1" r:id="rIdbsgw-ozdivwqosetj5hyk">
+      <w:hyperlink w:history="1" r:id="rIdergm8fha3kqdetwxh_lua">
         <w:r>
           <w:rPr>
             <w:rStyle w:val="Hyperlink"/>

</xml_diff>